<commit_message>
Apply GPT-review legal refinements to SHA v2, IP License, redline & email
- License terminable upon specified events (not revocable at will)
- 51% termination triggers only on BNBL-unapproved dilution; approved investment/IPO/restructuring keeps license alive
- Split Technical Improvements (BNBL) vs Commercial Data (Company, BNBL access right)
- Add Section 83(b) service-equity tax responsibility clause (SHA 3.4)
- Royalty on arm's-length / transfer-pricing basis (IP License 4.1)
- Reframe Article 7 to Restrictive Covenants: confidentiality/non-solicit/non-circumvention/IP-protection; narrow non-compete
- Schedule A references Confidential Technical File instead of disclosing trade secrets
- Email: add IP License 'review draft' buffer; soften redline wording

https://claude.ai/code/session_01SkX9Nkj6o3KuWJL6HpkMeT
</commit_message>
<xml_diff>
--- a/Email_Reply_DRAFT_KR.docx
+++ b/Email_Reply_DRAFT_KR.docx
@@ -251,7 +251,22 @@
         <w:rPr>
           <w:i w:val="0"/>
         </w:rPr>
-        <w:t>검토하신 후 의견 주시면, 미국 변호사 redline까지 정리하여 다시 공유드리겠습니다. 이후 세 사람이 함께 화상 미팅으로 큰 방향을 맞추는 자리를 가지면 좋겠습니다. 가능하신 일정 알려주시면 조율하겠습니다.</w:t>
+        <w:t>참고로, 첨부드린 IP License Agreement는 최종안이 아니라, BNBL Background IP를 미국 법인에 출자하지 않는다는 원칙을 문서화하기 위한 검토용 초안입니다. 세부 royalty, field of use, territory, termination 조건은 세 사람이 큰 방향을 맞춘 뒤 미국 변호사 검토를 거쳐 확정하면 좋겠습니다.</w:t>
+      </w:r>
+    </w:p>
+    <w:p>
+      <w:r>
+        <w:rPr>
+          <w:i w:val="0"/>
+        </w:rPr>
+      </w:r>
+    </w:p>
+    <w:p>
+      <w:r>
+        <w:rPr>
+          <w:i w:val="0"/>
+        </w:rPr>
+        <w:t>검토하신 후 의견 주시면, 해당 내용을 반영하여 미국 변호사 검토용 redline 초안으로 정리해 보겠습니다. 이후 세 사람이 함께 화상 미팅으로 큰 방향을 맞추는 자리를 가지면 좋겠습니다. 가능하신 일정 알려주시면 조율하겠습니다.</w:t>
       </w:r>
     </w:p>
     <w:p>

</xml_diff>

<commit_message>
Fix cross-document consistency for Field of Use / Territory
- SHA 7.1: replace [define field/territory] brackets with reference to Article 1.7
- IP License Schedule A: Field of Use / Territory now 'as defined in Article 1' (only Royalty remains bracketed)
- Email draft: remove stale 'field/territory undefined' line; note baseline definitions included, final scope to confirm
- Redline Summary Open Items: Field/Territory baseline included (final scope TBC); add Royalty rate and Schedule 1 final figures

https://claude.ai/code/session_01SkX9Nkj6o3KuWJL6HpkMeT
</commit_message>
<xml_diff>
--- a/Email_Reply_DRAFT_KR.docx
+++ b/Email_Reply_DRAFT_KR.docx
@@ -251,7 +251,22 @@
         <w:rPr>
           <w:i w:val="0"/>
         </w:rPr>
-        <w:t>아직 법인 형태(Corp/LLC), 회사명, 출자액, field of use·territory 정의, 이사 수 등은 협의가 필요해 [ ] 로 남겨두었습니다. 이 부분은 함께 확정해 나가면 될 것 같습니다.</w:t>
+        <w:t>아직 법인 형태(Corp/LLC), 회사명, 출자액, 이사 수 등은 협의가 필요해 [ ] 로 남겨두었습니다. 이 부분은 함께 확정해 나가면 될 것 같습니다.</w:t>
+      </w:r>
+    </w:p>
+    <w:p>
+      <w:r>
+        <w:rPr>
+          <w:i w:val="0"/>
+        </w:rPr>
+      </w:r>
+    </w:p>
+    <w:p>
+      <w:r>
+        <w:rPr>
+          <w:i w:val="0"/>
+        </w:rPr>
+        <w:t>field of use·territory는 기본 정의를 반영해 두었으나, 최종 사업 범위와 적용 제품·파트너·프로젝트 범위는 세 사람이 함께 확인하면 좋겠습니다.</w:t>
       </w:r>
     </w:p>
     <w:p>

</xml_diff>